<commit_message>
added correlation analyses and reworked some graphs
</commit_message>
<xml_diff>
--- a/Results/Statistics_BfS_UVC.docx
+++ b/Results/Statistics_BfS_UVC.docx
@@ -34,51 +34,8 @@
         <w:rPr>
           <w:lang w:val="de-DE"/>
         </w:rPr>
-        <w:t xml:space="preserve">Aufgrund fehlender Normalität der Daten und einer Stichprobengröße, die die Anwendung des zentralen Grenzwertsatzes nicht ermöglicht, wurden die Daten mit non-parametrischen Methoden auf statistische Signifikanz untersucht. Der Vergleich zwischen den Gruppen erfolgte mittels </w:t>
-      </w:r>
-      <w:proofErr w:type="spellStart"/>
-      <w:r>
-        <w:rPr>
-          <w:lang w:val="de-DE"/>
-        </w:rPr>
-        <w:t>Wilcoxon</w:t>
-      </w:r>
-      <w:proofErr w:type="spellEnd"/>
-      <w:r>
-        <w:rPr>
-          <w:lang w:val="de-DE"/>
-        </w:rPr>
-        <w:t xml:space="preserve">-Rangsummentest </w:t>
-      </w:r>
-      <w:proofErr w:type="spellStart"/>
-      <w:r>
-        <w:rPr>
-          <w:lang w:val="de-DE"/>
-        </w:rPr>
-        <w:t>wilcoxon_</w:t>
-      </w:r>
-      <w:proofErr w:type="gramStart"/>
-      <w:r>
-        <w:rPr>
-          <w:lang w:val="de-DE"/>
-        </w:rPr>
-        <w:t>test</w:t>
-      </w:r>
-      <w:proofErr w:type="spellEnd"/>
-      <w:r>
-        <w:rPr>
-          <w:lang w:val="de-DE"/>
-        </w:rPr>
-        <w:t>(</w:t>
-      </w:r>
-      <w:proofErr w:type="gramEnd"/>
-      <w:r>
-        <w:rPr>
-          <w:lang w:val="de-DE"/>
-        </w:rPr>
-        <w:t xml:space="preserve">) aus dem R-Paket </w:t>
-      </w:r>
-      <w:proofErr w:type="spellStart"/>
+        <w:t xml:space="preserve">Aufgrund fehlender Normalität der Daten und einer Stichprobengröße, die die Anwendung des zentralen Grenzwertsatzes nicht ermöglicht, wurden die Daten mit non-parametrischen Methoden auf statistische Signifikanz untersucht. Der Vergleich zwischen den Gruppen erfolgte mittels Wilcoxon-Rangsummentest wilcoxon_test() aus dem R-Paket </w:t>
+      </w:r>
       <w:r>
         <w:rPr>
           <w:i/>
@@ -86,7 +43,6 @@
         </w:rPr>
         <w:t>rstatix</w:t>
       </w:r>
-      <w:proofErr w:type="spellEnd"/>
       <w:r>
         <w:rPr>
           <w:lang w:val="de-DE"/>
@@ -101,41 +57,13 @@
         <w:t xml:space="preserve">α-Fehler-Inflation vorzubeugen, wurden die P-Werte mittels </w:t>
       </w:r>
       <w:commentRangeStart w:id="0"/>
-      <w:proofErr w:type="spellStart"/>
       <w:r>
         <w:rPr>
           <w:rFonts w:cstheme="minorHAnsi"/>
           <w:i/>
           <w:lang w:val="de-DE"/>
         </w:rPr>
-        <w:t>false</w:t>
-      </w:r>
-      <w:proofErr w:type="spellEnd"/>
-      <w:r>
-        <w:rPr>
-          <w:rFonts w:cstheme="minorHAnsi"/>
-          <w:i/>
-          <w:lang w:val="de-DE"/>
-        </w:rPr>
-        <w:t xml:space="preserve"> </w:t>
-      </w:r>
-      <w:proofErr w:type="spellStart"/>
-      <w:r>
-        <w:rPr>
-          <w:rFonts w:cstheme="minorHAnsi"/>
-          <w:i/>
-          <w:lang w:val="de-DE"/>
-        </w:rPr>
-        <w:t>discovery</w:t>
-      </w:r>
-      <w:proofErr w:type="spellEnd"/>
-      <w:r>
-        <w:rPr>
-          <w:rFonts w:cstheme="minorHAnsi"/>
-          <w:i/>
-          <w:lang w:val="de-DE"/>
-        </w:rPr>
-        <w:t xml:space="preserve"> rate</w:t>
+        <w:t>false discovery rate</w:t>
       </w:r>
       <w:r>
         <w:rPr>
@@ -194,6 +122,98 @@
           <w:lang w:val="de-DE"/>
         </w:rPr>
         <w:t xml:space="preserve">. </w:t>
+      </w:r>
+      <w:r>
+        <w:rPr>
+          <w:rFonts w:cstheme="minorHAnsi"/>
+          <w:lang w:val="de-DE"/>
+        </w:rPr>
+        <w:t>Der Zusammenhang der Anzahl gezählter Zellkerne (basal vs. suprabasal) sowie ein möglicher Einfluss auf die Anzahl CPD-positiver Zellkerne wurde mittels linearer Regression und Pearson-Korrelation</w:t>
+      </w:r>
+      <w:r>
+        <w:rPr>
+          <w:rFonts w:cstheme="minorHAnsi"/>
+          <w:lang w:val="de-DE"/>
+        </w:rPr>
+        <w:t xml:space="preserve"> (</w:t>
+      </w:r>
+      <w:r>
+        <w:rPr>
+          <w:rFonts w:cstheme="minorHAnsi"/>
+          <w:i/>
+          <w:lang w:val="de-DE"/>
+        </w:rPr>
+        <w:t>ggpubr</w:t>
+      </w:r>
+      <w:r>
+        <w:rPr>
+          <w:rFonts w:cstheme="minorHAnsi"/>
+          <w:lang w:val="de-DE"/>
+        </w:rPr>
+        <w:t>::stat_cor())</w:t>
+      </w:r>
+      <w:r>
+        <w:rPr>
+          <w:rFonts w:cstheme="minorHAnsi"/>
+          <w:lang w:val="de-DE"/>
+        </w:rPr>
+        <w:t xml:space="preserve"> untersucht. </w:t>
+      </w:r>
+      <w:r>
+        <w:rPr>
+          <w:rFonts w:cstheme="minorHAnsi"/>
+          <w:lang w:val="de-DE"/>
+        </w:rPr>
+        <w:t>Die</w:t>
+      </w:r>
+      <w:r>
+        <w:rPr>
+          <w:rFonts w:cstheme="minorHAnsi"/>
+          <w:lang w:val="de-DE"/>
+        </w:rPr>
+        <w:t xml:space="preserve"> Korrelationskoeffizient</w:t>
+      </w:r>
+      <w:r>
+        <w:rPr>
+          <w:rFonts w:cstheme="minorHAnsi"/>
+          <w:lang w:val="de-DE"/>
+        </w:rPr>
+        <w:t>en</w:t>
+      </w:r>
+      <w:r>
+        <w:rPr>
+          <w:rFonts w:cstheme="minorHAnsi"/>
+          <w:lang w:val="de-DE"/>
+        </w:rPr>
+        <w:t xml:space="preserve"> sowie </w:t>
+      </w:r>
+      <w:r>
+        <w:rPr>
+          <w:rFonts w:cstheme="minorHAnsi"/>
+          <w:lang w:val="de-DE"/>
+        </w:rPr>
+        <w:t xml:space="preserve">die dazugehörigen </w:t>
+      </w:r>
+      <w:r>
+        <w:rPr>
+          <w:rFonts w:cstheme="minorHAnsi"/>
+          <w:lang w:val="de-DE"/>
+        </w:rPr>
+        <w:t>P-Wert</w:t>
+      </w:r>
+      <w:r>
+        <w:rPr>
+          <w:rFonts w:cstheme="minorHAnsi"/>
+          <w:lang w:val="de-DE"/>
+        </w:rPr>
+        <w:t>e</w:t>
+      </w:r>
+      <w:r>
+        <w:rPr>
+          <w:rFonts w:cstheme="minorHAnsi"/>
+          <w:lang w:val="de-DE"/>
+        </w:rPr>
+        <w:t xml:space="preserve"> sind in den Grafiken der jeweiligen Bedingungen abgebildet. </w:t>
       </w:r>
       <w:bookmarkStart w:id="1" w:name="_GoBack"/>
       <w:bookmarkEnd w:id="1"/>

</xml_diff>